<commit_message>
adding the file structure image to the word documentation
</commit_message>
<xml_diff>
--- a/Ass3_WebDesign/word documentation/System Documentation.docx
+++ b/Ass3_WebDesign/word documentation/System Documentation.docx
@@ -10,6 +10,15 @@
           <w:u w:val="single"/>
         </w:rPr>
       </w:pPr>
+    </w:p>
+    <w:p>
+      <w:pPr>
+        <w:rPr>
+          <w:b/>
+          <w:bCs/>
+          <w:u w:val="single"/>
+        </w:rPr>
+      </w:pPr>
       <w:r>
         <w:rPr>
           <w:b/>
@@ -117,9 +126,13 @@
     </w:p>
     <w:p>
       <w:pPr>
-        <w:rPr>
-          <w:b/>
-          <w:bCs/>
+        <w:jc w:val="center"/>
+        <w:rPr>
+          <w:b/>
+          <w:bCs/>
+          <w:sz w:val="28"/>
+          <w:szCs w:val="28"/>
+          <w:u w:val="single"/>
         </w:rPr>
       </w:pPr>
     </w:p>
@@ -186,7 +199,8 @@
     <w:p>
       <w:pPr>
         <w:rPr>
-          <w:u w:val="single"/>
+          <w:sz w:val="26"/>
+          <w:szCs w:val="26"/>
         </w:rPr>
       </w:pPr>
     </w:p>
@@ -208,325 +222,9 @@
           <w:szCs w:val="26"/>
           <w:u w:val="single"/>
         </w:rPr>
-        <w:t>2. System Architecture &amp; File Structure</w:t>
-      </w:r>
-    </w:p>
-    <w:p>
-      <w:r>
-        <w:t>Plaintext</w:t>
-      </w:r>
-    </w:p>
-    <w:p>
-      <w:r>
-        <w:t>Ass3_WebDesign/</w:t>
-      </w:r>
-    </w:p>
-    <w:p>
-      <w:r>
-        <w:rPr>
-          <w:rFonts w:ascii="MS Gothic" w:eastAsia="MS Gothic" w:hAnsi="MS Gothic" w:cs="MS Gothic" w:hint="eastAsia"/>
-        </w:rPr>
-        <w:t>├</w:t>
-      </w:r>
-      <w:r>
-        <w:rPr>
-          <w:rFonts w:ascii="Calibri" w:hAnsi="Calibri" w:cs="Calibri"/>
-        </w:rPr>
-        <w:t>──</w:t>
-      </w:r>
-      <w:r>
-        <w:t xml:space="preserve"> config/</w:t>
-      </w:r>
-    </w:p>
-    <w:p>
-      <w:r>
-        <w:t xml:space="preserve">│   └── </w:t>
-      </w:r>
-      <w:proofErr w:type="spellStart"/>
-      <w:r>
-        <w:t>db.php</w:t>
-      </w:r>
-      <w:proofErr w:type="spellEnd"/>
-      <w:r>
-        <w:t xml:space="preserve">               # MySQL Database Connection Logic</w:t>
-      </w:r>
-    </w:p>
-    <w:p>
-      <w:r>
-        <w:rPr>
-          <w:rFonts w:ascii="MS Gothic" w:eastAsia="MS Gothic" w:hAnsi="MS Gothic" w:cs="MS Gothic" w:hint="eastAsia"/>
-        </w:rPr>
-        <w:t>├</w:t>
-      </w:r>
-      <w:r>
-        <w:rPr>
-          <w:rFonts w:ascii="Calibri" w:hAnsi="Calibri" w:cs="Calibri"/>
-        </w:rPr>
-        <w:t>──</w:t>
-      </w:r>
-      <w:r>
-        <w:t xml:space="preserve"> </w:t>
-      </w:r>
-      <w:proofErr w:type="spellStart"/>
-      <w:r>
-        <w:t>css</w:t>
-      </w:r>
-      <w:proofErr w:type="spellEnd"/>
-      <w:r>
-        <w:t>/</w:t>
-      </w:r>
-    </w:p>
-    <w:p>
-      <w:r>
-        <w:t>│   └── style.css            # Global Application Stylesheet</w:t>
-      </w:r>
-    </w:p>
-    <w:p>
-      <w:r>
-        <w:rPr>
-          <w:rFonts w:ascii="MS Gothic" w:eastAsia="MS Gothic" w:hAnsi="MS Gothic" w:cs="MS Gothic" w:hint="eastAsia"/>
-        </w:rPr>
-        <w:lastRenderedPageBreak/>
-        <w:t>├</w:t>
-      </w:r>
-      <w:r>
-        <w:rPr>
-          <w:rFonts w:ascii="Calibri" w:hAnsi="Calibri" w:cs="Calibri"/>
-        </w:rPr>
-        <w:t>──</w:t>
-      </w:r>
-      <w:r>
-        <w:t xml:space="preserve"> images/                  # Application Graphic Assets</w:t>
-      </w:r>
-    </w:p>
-    <w:p>
-      <w:r>
-        <w:t>│   └── signup.png           # Sign-up Page Illustration</w:t>
-      </w:r>
-    </w:p>
-    <w:p>
-      <w:r>
-        <w:rPr>
-          <w:rFonts w:ascii="MS Gothic" w:eastAsia="MS Gothic" w:hAnsi="MS Gothic" w:cs="MS Gothic" w:hint="eastAsia"/>
-        </w:rPr>
-        <w:t>├</w:t>
-      </w:r>
-      <w:r>
-        <w:rPr>
-          <w:rFonts w:ascii="Calibri" w:hAnsi="Calibri" w:cs="Calibri"/>
-        </w:rPr>
-        <w:t>──</w:t>
-      </w:r>
-      <w:r>
-        <w:t xml:space="preserve"> </w:t>
-      </w:r>
-      <w:proofErr w:type="spellStart"/>
-      <w:r>
-        <w:t>index.php</w:t>
-      </w:r>
-      <w:proofErr w:type="spellEnd"/>
-      <w:r>
-        <w:t xml:space="preserve">                # System Landing/Home Page</w:t>
-      </w:r>
-    </w:p>
-    <w:p>
-      <w:r>
-        <w:rPr>
-          <w:rFonts w:ascii="MS Gothic" w:eastAsia="MS Gothic" w:hAnsi="MS Gothic" w:cs="MS Gothic" w:hint="eastAsia"/>
-        </w:rPr>
-        <w:t>├</w:t>
-      </w:r>
-      <w:r>
-        <w:rPr>
-          <w:rFonts w:ascii="Calibri" w:hAnsi="Calibri" w:cs="Calibri"/>
-        </w:rPr>
-        <w:t>──</w:t>
-      </w:r>
-      <w:r>
-        <w:t xml:space="preserve"> </w:t>
-      </w:r>
-      <w:proofErr w:type="spellStart"/>
-      <w:r>
-        <w:t>signup.php</w:t>
-      </w:r>
-      <w:proofErr w:type="spellEnd"/>
-      <w:r>
-        <w:t xml:space="preserve">               # Registration Form Interface</w:t>
-      </w:r>
-    </w:p>
-    <w:p>
-      <w:r>
-        <w:rPr>
-          <w:rFonts w:ascii="MS Gothic" w:eastAsia="MS Gothic" w:hAnsi="MS Gothic" w:cs="MS Gothic" w:hint="eastAsia"/>
-        </w:rPr>
-        <w:t>├</w:t>
-      </w:r>
-      <w:r>
-        <w:rPr>
-          <w:rFonts w:ascii="Calibri" w:hAnsi="Calibri" w:cs="Calibri"/>
-        </w:rPr>
-        <w:t>──</w:t>
-      </w:r>
-      <w:r>
-        <w:t xml:space="preserve"> </w:t>
-      </w:r>
-      <w:proofErr w:type="spellStart"/>
-      <w:r>
-        <w:t>signup_process.php</w:t>
-      </w:r>
-      <w:proofErr w:type="spellEnd"/>
-      <w:r>
-        <w:t xml:space="preserve">       # Registration Validation &amp; Data Processing</w:t>
-      </w:r>
-    </w:p>
-    <w:p>
-      <w:r>
-        <w:rPr>
-          <w:rFonts w:ascii="MS Gothic" w:eastAsia="MS Gothic" w:hAnsi="MS Gothic" w:cs="MS Gothic" w:hint="eastAsia"/>
-        </w:rPr>
-        <w:t>├</w:t>
-      </w:r>
-      <w:r>
-        <w:rPr>
-          <w:rFonts w:ascii="Calibri" w:hAnsi="Calibri" w:cs="Calibri"/>
-        </w:rPr>
-        <w:t>──</w:t>
-      </w:r>
-      <w:r>
-        <w:t xml:space="preserve"> </w:t>
-      </w:r>
-      <w:proofErr w:type="spellStart"/>
-      <w:r>
-        <w:t>login.php</w:t>
-      </w:r>
-      <w:proofErr w:type="spellEnd"/>
-      <w:r>
-        <w:t xml:space="preserve">                # Authentication Interface &amp; Logic</w:t>
-      </w:r>
-    </w:p>
-    <w:p>
-      <w:r>
-        <w:rPr>
-          <w:rFonts w:ascii="MS Gothic" w:eastAsia="MS Gothic" w:hAnsi="MS Gothic" w:cs="MS Gothic" w:hint="eastAsia"/>
-        </w:rPr>
-        <w:t>├</w:t>
-      </w:r>
-      <w:r>
-        <w:rPr>
-          <w:rFonts w:ascii="Calibri" w:hAnsi="Calibri" w:cs="Calibri"/>
-        </w:rPr>
-        <w:t>──</w:t>
-      </w:r>
-      <w:r>
-        <w:t xml:space="preserve"> </w:t>
-      </w:r>
-      <w:proofErr w:type="spellStart"/>
-      <w:r>
-        <w:t>profile.php</w:t>
-      </w:r>
-      <w:proofErr w:type="spellEnd"/>
-      <w:r>
-        <w:t xml:space="preserve">              # Secure Profile View Interface</w:t>
-      </w:r>
-    </w:p>
-    <w:p>
-      <w:r>
-        <w:rPr>
-          <w:rFonts w:ascii="MS Gothic" w:eastAsia="MS Gothic" w:hAnsi="MS Gothic" w:cs="MS Gothic" w:hint="eastAsia"/>
-        </w:rPr>
-        <w:t>├</w:t>
-      </w:r>
-      <w:r>
-        <w:rPr>
-          <w:rFonts w:ascii="Calibri" w:hAnsi="Calibri" w:cs="Calibri"/>
-        </w:rPr>
-        <w:t>──</w:t>
-      </w:r>
-      <w:r>
-        <w:t xml:space="preserve"> update-</w:t>
-      </w:r>
-      <w:proofErr w:type="spellStart"/>
-      <w:r>
-        <w:t>profile.php</w:t>
-      </w:r>
-      <w:proofErr w:type="spellEnd"/>
-      <w:r>
-        <w:t xml:space="preserve">       # Account Update Interface &amp; Logic</w:t>
-      </w:r>
-    </w:p>
-    <w:p>
-      <w:r>
-        <w:rPr>
-          <w:rFonts w:ascii="MS Gothic" w:eastAsia="MS Gothic" w:hAnsi="MS Gothic" w:cs="MS Gothic" w:hint="eastAsia"/>
-        </w:rPr>
-        <w:t>├</w:t>
-      </w:r>
-      <w:r>
-        <w:rPr>
-          <w:rFonts w:ascii="Calibri" w:hAnsi="Calibri" w:cs="Calibri"/>
-        </w:rPr>
-        <w:t>──</w:t>
-      </w:r>
-      <w:r>
-        <w:t xml:space="preserve"> delete-</w:t>
-      </w:r>
-      <w:proofErr w:type="spellStart"/>
-      <w:r>
-        <w:t>profile.php</w:t>
-      </w:r>
-      <w:proofErr w:type="spellEnd"/>
-      <w:r>
-        <w:t xml:space="preserve">       # Account Deletion Action Handler</w:t>
-      </w:r>
-    </w:p>
-    <w:p>
-      <w:r>
-        <w:rPr>
-          <w:rFonts w:ascii="MS Gothic" w:eastAsia="MS Gothic" w:hAnsi="MS Gothic" w:cs="MS Gothic" w:hint="eastAsia"/>
-        </w:rPr>
-        <w:t>├</w:t>
-      </w:r>
-      <w:r>
-        <w:rPr>
-          <w:rFonts w:ascii="Calibri" w:hAnsi="Calibri" w:cs="Calibri"/>
-        </w:rPr>
-        <w:t>──</w:t>
-      </w:r>
-      <w:r>
-        <w:t xml:space="preserve"> </w:t>
-      </w:r>
-      <w:proofErr w:type="spellStart"/>
-      <w:r>
-        <w:t>logout.php</w:t>
-      </w:r>
-      <w:proofErr w:type="spellEnd"/>
-      <w:r>
-        <w:t xml:space="preserve">               # Session Termination Logic</w:t>
-      </w:r>
-    </w:p>
-    <w:p>
-      <w:r>
-        <w:t xml:space="preserve">└── </w:t>
-      </w:r>
-      <w:proofErr w:type="spellStart"/>
-      <w:r>
-        <w:t>users.sql</w:t>
-      </w:r>
-      <w:proofErr w:type="spellEnd"/>
-      <w:r>
-        <w:t xml:space="preserve">                # Database Schema &amp; Initial Data Dump</w:t>
-      </w:r>
-    </w:p>
-    <w:p>
-      <w:pPr>
-        <w:rPr>
-          <w:sz w:val="26"/>
-          <w:szCs w:val="26"/>
-        </w:rPr>
-      </w:pPr>
-    </w:p>
-    <w:p>
-      <w:pPr>
+        <w:t>2</w:t>
+      </w:r>
+      <w:r>
         <w:rPr>
           <w:b/>
           <w:bCs/>
@@ -534,7 +232,9 @@
           <w:szCs w:val="26"/>
           <w:u w:val="single"/>
         </w:rPr>
-      </w:pPr>
+        <w:t>. Database Architecture (</w:t>
+      </w:r>
+      <w:proofErr w:type="spellStart"/>
       <w:r>
         <w:rPr>
           <w:b/>
@@ -543,9 +243,9 @@
           <w:szCs w:val="26"/>
           <w:u w:val="single"/>
         </w:rPr>
-        <w:t>3. Database Architecture (</w:t>
-      </w:r>
-      <w:proofErr w:type="spellStart"/>
+        <w:t>users.sql</w:t>
+      </w:r>
+      <w:proofErr w:type="spellEnd"/>
       <w:r>
         <w:rPr>
           <w:b/>
@@ -554,47 +254,42 @@
           <w:szCs w:val="26"/>
           <w:u w:val="single"/>
         </w:rPr>
-        <w:t>users.sql</w:t>
+        <w:t>)</w:t>
+      </w:r>
+    </w:p>
+    <w:p>
+      <w:r>
+        <w:t xml:space="preserve">The database consists of a single relational table named </w:t>
+      </w:r>
+      <w:r>
+        <w:rPr>
+          <w:b/>
+          <w:bCs/>
+        </w:rPr>
+        <w:t>users</w:t>
+      </w:r>
+      <w:r>
+        <w:t xml:space="preserve"> stored inside the </w:t>
+      </w:r>
+      <w:proofErr w:type="spellStart"/>
+      <w:r>
+        <w:rPr>
+          <w:b/>
+          <w:bCs/>
+        </w:rPr>
+        <w:t>user_profile_system</w:t>
       </w:r>
       <w:proofErr w:type="spellEnd"/>
       <w:r>
-        <w:rPr>
-          <w:b/>
-          <w:bCs/>
-          <w:sz w:val="26"/>
-          <w:szCs w:val="26"/>
-          <w:u w:val="single"/>
-        </w:rPr>
-        <w:t>)</w:t>
-      </w:r>
-    </w:p>
-    <w:p>
-      <w:r>
-        <w:t xml:space="preserve">The database consists of a single relational table named </w:t>
-      </w:r>
-      <w:r>
-        <w:rPr>
-          <w:b/>
-          <w:bCs/>
-        </w:rPr>
-        <w:t>users</w:t>
-      </w:r>
-      <w:r>
-        <w:t xml:space="preserve"> stored inside the </w:t>
-      </w:r>
-      <w:proofErr w:type="spellStart"/>
-      <w:r>
-        <w:rPr>
-          <w:b/>
-          <w:bCs/>
-        </w:rPr>
-        <w:t>user_profile_system</w:t>
-      </w:r>
-      <w:proofErr w:type="spellEnd"/>
-      <w:r>
         <w:t xml:space="preserve"> database schema. </w:t>
       </w:r>
     </w:p>
+    <w:p>
+      <w:r>
+        <w:br w:type="page"/>
+      </w:r>
+    </w:p>
+    <w:p/>
     <w:p>
       <w:pPr>
         <w:rPr>
@@ -960,10 +655,7 @@
             </w:r>
             <w:proofErr w:type="gramEnd"/>
             <w:r>
-              <w:t>50</w:t>
-            </w:r>
-            <w:r>
-              <w:t>)</w:t>
+              <w:t>50)</w:t>
             </w:r>
           </w:p>
         </w:tc>
@@ -1013,10 +705,7 @@
             </w:r>
             <w:proofErr w:type="gramEnd"/>
             <w:r>
-              <w:t>255</w:t>
-            </w:r>
-            <w:r>
-              <w:t>)</w:t>
+              <w:t>255)</w:t>
             </w:r>
           </w:p>
         </w:tc>
@@ -1099,7 +788,6 @@
           <w:p>
             <w:proofErr w:type="spellStart"/>
             <w:r>
-              <w:lastRenderedPageBreak/>
               <w:t>updated_at</w:t>
             </w:r>
             <w:proofErr w:type="spellEnd"/>
@@ -1171,6 +859,97 @@
           <w:szCs w:val="26"/>
           <w:u w:val="single"/>
         </w:rPr>
+        <w:t>3</w:t>
+      </w:r>
+      <w:r>
+        <w:rPr>
+          <w:b/>
+          <w:bCs/>
+          <w:sz w:val="26"/>
+          <w:szCs w:val="26"/>
+          <w:u w:val="single"/>
+        </w:rPr>
+        <w:t>. System Architecture &amp; File Structure</w:t>
+      </w:r>
+    </w:p>
+    <w:p>
+      <w:pPr>
+        <w:rPr>
+          <w:b/>
+          <w:bCs/>
+        </w:rPr>
+      </w:pPr>
+      <w:r>
+        <w:rPr>
+          <w:b/>
+          <w:bCs/>
+          <w:sz w:val="26"/>
+          <w:szCs w:val="26"/>
+          <w:u w:val="single"/>
+        </w:rPr>
+        <w:drawing>
+          <wp:inline distT="0" distB="0" distL="0" distR="0" wp14:anchorId="11CA8CBC" wp14:editId="66D181CC">
+            <wp:extent cx="3149464" cy="3208283"/>
+            <wp:effectExtent l="0" t="0" r="0" b="0"/>
+            <wp:docPr id="98403182" name="Picture 1"/>
+            <wp:cNvGraphicFramePr>
+              <a:graphicFrameLocks xmlns:a="http://schemas.openxmlformats.org/drawingml/2006/main" noChangeAspect="1"/>
+            </wp:cNvGraphicFramePr>
+            <a:graphic xmlns:a="http://schemas.openxmlformats.org/drawingml/2006/main">
+              <a:graphicData uri="http://schemas.openxmlformats.org/drawingml/2006/picture">
+                <pic:pic xmlns:pic="http://schemas.openxmlformats.org/drawingml/2006/picture">
+                  <pic:nvPicPr>
+                    <pic:cNvPr id="98403182" name=""/>
+                    <pic:cNvPicPr/>
+                  </pic:nvPicPr>
+                  <pic:blipFill>
+                    <a:blip r:embed="rId5"/>
+                    <a:stretch>
+                      <a:fillRect/>
+                    </a:stretch>
+                  </pic:blipFill>
+                  <pic:spPr>
+                    <a:xfrm>
+                      <a:off x="0" y="0"/>
+                      <a:ext cx="3211481" cy="3271458"/>
+                    </a:xfrm>
+                    <a:prstGeom prst="rect">
+                      <a:avLst/>
+                    </a:prstGeom>
+                  </pic:spPr>
+                </pic:pic>
+              </a:graphicData>
+            </a:graphic>
+          </wp:inline>
+        </w:drawing>
+      </w:r>
+    </w:p>
+    <w:p>
+      <w:pPr>
+        <w:rPr>
+          <w:b/>
+          <w:bCs/>
+        </w:rPr>
+      </w:pPr>
+    </w:p>
+    <w:p>
+      <w:pPr>
+        <w:rPr>
+          <w:b/>
+          <w:bCs/>
+          <w:sz w:val="26"/>
+          <w:szCs w:val="26"/>
+          <w:u w:val="single"/>
+        </w:rPr>
+      </w:pPr>
+      <w:r>
+        <w:rPr>
+          <w:b/>
+          <w:bCs/>
+          <w:sz w:val="26"/>
+          <w:szCs w:val="26"/>
+          <w:u w:val="single"/>
+        </w:rPr>
         <w:t>4. Technical Component Breakdown</w:t>
       </w:r>
     </w:p>
@@ -1583,7 +1362,6 @@
           <w:b/>
           <w:bCs/>
         </w:rPr>
-        <w:lastRenderedPageBreak/>
         <w:t>UI (</w:t>
       </w:r>
       <w:proofErr w:type="spellStart"/>
@@ -1680,6 +1458,7 @@
           <w:b/>
           <w:bCs/>
         </w:rPr>
+        <w:lastRenderedPageBreak/>
         <w:t>Validatio</w:t>
       </w:r>
       <w:r>
@@ -2107,7 +1886,6 @@
           <w:b/>
           <w:bCs/>
         </w:rPr>
-        <w:lastRenderedPageBreak/>
         <w:t>Authentication Check</w:t>
       </w:r>
       <w:r>
@@ -2182,6 +1960,7 @@
           <w:b/>
           <w:bCs/>
         </w:rPr>
+        <w:lastRenderedPageBreak/>
         <w:t>UI Display</w:t>
       </w:r>
       <w:r>
@@ -2607,7 +2386,6 @@
           <w:b/>
           <w:bCs/>
         </w:rPr>
-        <w:lastRenderedPageBreak/>
         <w:t>Execution Flow</w:t>
       </w:r>
       <w:r>
@@ -2677,6 +2455,28 @@
           <w:szCs w:val="26"/>
           <w:u w:val="single"/>
         </w:rPr>
+        <w:br w:type="page"/>
+      </w:r>
+    </w:p>
+    <w:p>
+      <w:pPr>
+        <w:rPr>
+          <w:b/>
+          <w:bCs/>
+          <w:sz w:val="26"/>
+          <w:szCs w:val="26"/>
+          <w:u w:val="single"/>
+        </w:rPr>
+      </w:pPr>
+      <w:r>
+        <w:rPr>
+          <w:b/>
+          <w:bCs/>
+          <w:sz w:val="26"/>
+          <w:szCs w:val="26"/>
+          <w:u w:val="single"/>
+        </w:rPr>
+        <w:lastRenderedPageBreak/>
         <w:t>5. Security &amp; Design Patterns Applied</w:t>
       </w:r>
     </w:p>
@@ -4743,6 +4543,7 @@
   <w:style w:type="character" w:default="1" w:styleId="DefaultParagraphFont">
     <w:name w:val="Default Paragraph Font"/>
     <w:uiPriority w:val="1"/>
+    <w:semiHidden/>
     <w:unhideWhenUsed/>
   </w:style>
   <w:style w:type="table" w:default="1" w:styleId="TableNormal">

</xml_diff>

<commit_message>
adding a missing id to the word documentation
</commit_message>
<xml_diff>
--- a/Ass3_WebDesign/word documentation/System Documentation.docx
+++ b/Ass3_WebDesign/word documentation/System Documentation.docx
@@ -99,6 +99,13 @@
     <w:p>
       <w:r>
         <w:t xml:space="preserve">NIYOKWIZIGIRWA Carmel </w:t>
+      </w:r>
+      <w:r>
+        <w:rPr>
+          <w:b/>
+          <w:bCs/>
+        </w:rPr>
+        <w:t>29559</w:t>
       </w:r>
     </w:p>
     <w:p/>
@@ -883,6 +890,7 @@
         <w:rPr>
           <w:b/>
           <w:bCs/>
+          <w:noProof/>
           <w:sz w:val="26"/>
           <w:szCs w:val="26"/>
           <w:u w:val="single"/>

</xml_diff>